<commit_message>
docs(entregas): docs de sprint (S0-S4) + auditorias 26/27/28-05
- Auditorias 2026-05-{26,27,28}: 6 frentes cada + RESUMO-EXECUTIVO + QUICKWINS (.md)
- Docs de tarefa (.docx) das Sprints 0-4 em ABNT, relatórios finais
- Artigo ENEGEP (corpo + capa)

Co-Authored-By: Claude Opus 4.7 <noreply@anthropic.com>
</commit_message>
<xml_diff>
--- a/Entregas/Sprint 1/Desenvolvimento Backend/H3 - Desenvolver API de upload multi-formato/PSP2 - S1T12 - Endpoint de Upload.docx
+++ b/Entregas/Sprint 1/Desenvolvimento Backend/H3 - Desenvolver API de upload multi-formato/PSP2 - S1T12 - Endpoint de Upload.docx
@@ -46,6 +46,62 @@
       </w:pPr>
       <w:r>
         <w:t xml:space="preserve"/>
+      </w:r>
+    </w:p>
+    <w:p>
+      <w:pPr>
+        <w:pStyle w:val="Heading2"/>
+        <w:spacing w:after="180" w:before="120"/>
+      </w:pPr>
+      <w:r>
+        <w:rPr>
+          <w:rFonts w:ascii="Arial" w:cs="Arial" w:eastAsia="Arial" w:hAnsi="Arial"/>
+          <w:b/>
+          <w:bCs/>
+          <w:color w:val="1F3864"/>
+          <w:sz w:val="28"/>
+          <w:szCs w:val="28"/>
+        </w:rPr>
+        <w:t xml:space="preserve">📖 Em palavras simples</w:t>
+      </w:r>
+    </w:p>
+    <w:p>
+      <w:pPr>
+        <w:spacing w:after="180"/>
+      </w:pPr>
+      <w:r>
+        <w:rPr>
+          <w:rFonts w:ascii="Arial" w:cs="Arial" w:eastAsia="Arial" w:hAnsi="Arial"/>
+          <w:sz w:val="22"/>
+          <w:szCs w:val="22"/>
+        </w:rPr>
+        <w:t xml:space="preserve">O “endpoint” é o ponto de entrada no servidor que o frontend chama quando o aluno termina um upload. Esse endpoint recebe os dados do arquivo (nome, tamanho, formato, onde foi salvo no Storage), confere se é o dono mesmo que está mandando, e dispara o processamento em segundo plano.</w:t>
+      </w:r>
+    </w:p>
+    <w:p>
+      <w:pPr>
+        <w:spacing w:after="180"/>
+      </w:pPr>
+      <w:r>
+        <w:rPr>
+          <w:rFonts w:ascii="Arial" w:cs="Arial" w:eastAsia="Arial" w:hAnsi="Arial"/>
+          <w:sz w:val="22"/>
+          <w:szCs w:val="22"/>
+        </w:rPr>
+        <w:t xml:space="preserve">Detalhe importante: o arquivo em si NÃO passa por esse endpoint. O servidor tem limite de 60 segundos por chamada, e um upload grande estouraria. Em vez disso, o frontend pega uma “URL temporária” (signed URL) e manda o arquivo direto pro Storage. O endpoint só recebe a confirmação e o nome do arquivo.</w:t>
+      </w:r>
+    </w:p>
+    <w:p>
+      <w:pPr>
+        <w:spacing w:after="180"/>
+      </w:pPr>
+      <w:r>
+        <w:rPr>
+          <w:rFonts w:ascii="Arial" w:cs="Arial" w:eastAsia="Arial" w:hAnsi="Arial"/>
+          <w:sz w:val="22"/>
+          <w:szCs w:val="22"/>
+        </w:rPr>
+        <w:t xml:space="preserve">Por que isso importa? Esse desenho permite uploads de até 50 MB sem estourar limite, mantém a chave do servidor segura (ela não vai pro frontend), e desacopla o “sobe arquivo” do “processa arquivo”. Se o processamento demorar 2 minutos, o aluno não fica esperando travado: o navegador devolve resposta em milissegundos e o trabalho continua nos bastidores.</w:t>
       </w:r>
     </w:p>
     <w:p>

</xml_diff>